<commit_message>
offre référencement IA (GEO) : test gratuit, audit 790 €, suivi et accompagnement mensuels
- /tarifs/ : section référencement IA refaite (test « Votre nom sort-il ? »
  gratuit, audit référencement IA 790 €, suivi 290 €/mois, accompagnement
  790 €/mois), pack audit SEO + audit IA à 1 090 €, formule SEO Référence
  retirée, tableau du marché et OfferCatalog à jour
- mêmes prix dans l'accueil, llms.txt, llms-full.txt, les FAQ de l'outil
  d'audit (FR et EN) et la plaquette tarifaire
- formulaire de contact : le paramètre ?sujet= pré-remplit le sujet

Co-Authored-By: Claude Opus 5.5 <noreply@anthropic.com>
</commit_message>
<xml_diff>
--- a/_tarifs/Plaquette-Tarifs-MKZ-2026.docx
+++ b/_tarifs/Plaquette-Tarifs-MKZ-2026.docx
@@ -1670,7 +1670,7 @@
                 <w:sz w:val="20"/>
                 <w:szCs w:val="20"/>
               </w:rPr>
-              <w:t xml:space="preserve">Audit SEO + visibilité IA</w:t>
+              <w:t xml:space="preserve">Audit SEO + audit référencement IA</w:t>
             </w:r>
           </w:p>
         </w:tc>
@@ -1689,7 +1689,7 @@
                 <w:sz w:val="19"/>
                 <w:szCs w:val="19"/>
               </w:rPr>
-              <w:t xml:space="preserve">L’audit complet, plus la mesure réelle de vos citations par ChatGPT, Perplexity, Gemini et Mistral.</w:t>
+              <w:t xml:space="preserve">Les deux audits ensemble : Google d’un côté, ChatGPT, Perplexity, Gemini et les aperçus IA de Google de l’autre (détail en partie 3). 1 280 € séparément.</w:t>
             </w:r>
           </w:p>
         </w:tc>
@@ -1712,7 +1712,7 @@
                 <w:szCs w:val="20"/>
                 <w:color w:val="003764"/>
               </w:rPr>
-              <w:t xml:space="preserve">690 €</w:t>
+              <w:t xml:space="preserve">1 090 €</w:t>
             </w:r>
           </w:p>
         </w:tc>
@@ -2098,70 +2098,6 @@
           </w:p>
         </w:tc>
       </w:tr>
-      <w:tr>
-        <w:tc>
-          <w:tcPr>
-            <w:tcW w:w="2500" w:type="dxa"/>
-            <w:vAlign w:val="center"/>
-          </w:tcPr>
-          <w:p>
-            <w:pPr>
-              <w:spacing w:before="0" w:after="20" w:line="264" w:lineRule="auto"/>
-            </w:pPr>
-            <w:r>
-              <w:rPr>
-                <w:rFonts w:ascii="Calibri" w:hAnsi="Calibri" w:cs="Calibri"/>
-                <w:b/>
-                <w:sz w:val="20"/>
-                <w:szCs w:val="20"/>
-              </w:rPr>
-              <w:t xml:space="preserve">Référence</w:t>
-            </w:r>
-          </w:p>
-        </w:tc>
-        <w:tc>
-          <w:tcPr>
-            <w:tcW w:w="5238" w:type="dxa"/>
-            <w:vAlign w:val="center"/>
-          </w:tcPr>
-          <w:p>
-            <w:pPr>
-              <w:spacing w:before="0" w:after="20" w:line="264" w:lineRule="auto"/>
-            </w:pPr>
-            <w:r>
-              <w:rPr>
-                <w:rFonts w:ascii="Calibri" w:hAnsi="Calibri" w:cs="Calibri"/>
-                <w:sz w:val="19"/>
-                <w:szCs w:val="19"/>
-              </w:rPr>
-              <w:t xml:space="preserve">4 contenus, netlinking renforcé, référencement IA inclus (citations re-mesurées chaque mois), veille concurrentielle.</w:t>
-            </w:r>
-          </w:p>
-        </w:tc>
-        <w:tc>
-          <w:tcPr>
-            <w:tcW w:w="1900" w:type="dxa"/>
-            <w:shd w:val="clear" w:color="auto" w:fill="F2F2F2"/>
-            <w:vAlign w:val="center"/>
-          </w:tcPr>
-          <w:p>
-            <w:pPr>
-              <w:spacing w:before="0" w:after="20" w:line="264" w:lineRule="auto"/>
-              <w:jc w:val="right"/>
-            </w:pPr>
-            <w:r>
-              <w:rPr>
-                <w:rFonts w:ascii="Calibri" w:hAnsi="Calibri" w:cs="Calibri"/>
-                <w:b/>
-                <w:sz w:val="20"/>
-                <w:szCs w:val="20"/>
-                <w:color w:val="003764"/>
-              </w:rPr>
-              <w:t xml:space="preserve">1 190 €/mois</w:t>
-            </w:r>
-          </w:p>
-        </w:tc>
-      </w:tr>
     </w:tbl>
     <w:p>
       <w:pPr>
@@ -2175,7 +2111,7 @@
           <w:szCs w:val="18"/>
           <w:color w:val="595959"/>
         </w:rPr>
-        <w:t xml:space="preserve">Sans engagement de durée, préavis de 30 jours. Le référencement est un travail de fond : comptez 6 mois pour des résultats solides. Nous vous le disons avant de facturer, pas après.</w:t>
+        <w:t xml:space="preserve">Sans engagement de durée, préavis de 30 jours. Le référencement est un travail de fond : comptez 6 mois pour des résultats solides. Nous vous le disons avant de facturer, pas après. Le suivi mensuel des citations IA s’ajoute à l’une ou l’autre formule pour 200 € HT par mois.</w:t>
       </w:r>
     </w:p>
     <w:p>
@@ -2333,7 +2269,7 @@
           <w:sz w:val="21"/>
           <w:szCs w:val="21"/>
         </w:rPr>
-        <w:t xml:space="preserve">. Nous le mesurons réellement, requête par requête : jamais au doigt mouillé.</w:t>
+        <w:t xml:space="preserve">. Trouvé sur Google, cité par les IA : chaque résultat est mesuré, pas promis. Les mêmes questions sont reposées chaque mois, à l’identique, et le tableau dit ce qui a bougé.</w:t>
       </w:r>
     </w:p>
     <w:tbl>
@@ -2446,7 +2382,7 @@
                 <w:sz w:val="20"/>
                 <w:szCs w:val="20"/>
               </w:rPr>
-              <w:t xml:space="preserve">Audit de visibilité IA</w:t>
+              <w:t xml:space="preserve">Test « Votre nom sort-il ? »</w:t>
             </w:r>
           </w:p>
         </w:tc>
@@ -2465,7 +2401,7 @@
                 <w:sz w:val="19"/>
                 <w:szCs w:val="19"/>
               </w:rPr>
-              <w:t xml:space="preserve">Mesure réelle de vos citations sur ChatGPT, Perplexity, Gemini et Mistral, analyse sur 5 piliers, plan d’action priorisé.</w:t>
+              <w:t xml:space="preserve">Cinq questions qu’un de vos clients poserait, posées à ChatGPT et à Perplexity. Sous 48 h ouvrées, une page : votre nom sort-il, qui sort à votre place, et quelles pages ces moteurs lisent pour répondre.</w:t>
             </w:r>
           </w:p>
         </w:tc>
@@ -2488,7 +2424,7 @@
                 <w:szCs w:val="20"/>
                 <w:color w:val="003764"/>
               </w:rPr>
-              <w:t xml:space="preserve">490 €</w:t>
+              <w:t xml:space="preserve">Gratuit</w:t>
             </w:r>
           </w:p>
         </w:tc>
@@ -2510,7 +2446,7 @@
                 <w:sz w:val="20"/>
                 <w:szCs w:val="20"/>
               </w:rPr>
-              <w:t xml:space="preserve">Socle technique IA</w:t>
+              <w:t xml:space="preserve">Audit référencement IA</w:t>
             </w:r>
           </w:p>
         </w:tc>
@@ -2529,7 +2465,7 @@
                 <w:sz w:val="19"/>
                 <w:szCs w:val="19"/>
               </w:rPr>
-              <w:t xml:space="preserve">Fichier llms.txt, données structurées, robots IA autorisés, données chiffrées citables. Déjà inclus dans tout site créé par MKZ.</w:t>
+              <w:t xml:space="preserve">Vingt questions de vos clients, posées à ChatGPT, Perplexity, Gemini et aux aperçus IA de Google, trois fois chacune. Qui est cité à votre place et d’où vient chaque citation, accès des robots IA vérifié sur le site en ligne, contenus citables page par page, plan d’action sur 90 jours, restitution d’une heure en visio.</w:t>
             </w:r>
           </w:p>
         </w:tc>
@@ -2552,7 +2488,7 @@
                 <w:szCs w:val="20"/>
                 <w:color w:val="003764"/>
               </w:rPr>
-              <w:t xml:space="preserve">390 €</w:t>
+              <w:t xml:space="preserve">790 €</w:t>
             </w:r>
           </w:p>
         </w:tc>
@@ -2574,7 +2510,7 @@
                 <w:sz w:val="20"/>
                 <w:szCs w:val="20"/>
               </w:rPr>
-              <w:t xml:space="preserve">Option IA sur un accompagnement</w:t>
+              <w:t xml:space="preserve">Socle technique IA</w:t>
             </w:r>
           </w:p>
         </w:tc>
@@ -2593,7 +2529,7 @@
                 <w:sz w:val="19"/>
                 <w:szCs w:val="19"/>
               </w:rPr>
-              <w:t xml:space="preserve">Ajoutée à Fondations ou Croissance : citations re-mesurées chaque mois et optimisations continues. Incluse dans la formule Référence.</w:t>
+              <w:t xml:space="preserve">Fichier llms.txt, données structurées, robots IA autorisés, données chiffrées citables. Déjà inclus dans tout site créé par MKZ.</w:t>
             </w:r>
           </w:p>
         </w:tc>
@@ -2616,12 +2552,265 @@
                 <w:szCs w:val="20"/>
                 <w:color w:val="003764"/>
               </w:rPr>
-              <w:t xml:space="preserve">+200 €/mois</w:t>
+              <w:t xml:space="preserve">390 €</w:t>
             </w:r>
           </w:p>
         </w:tc>
       </w:tr>
     </w:tbl>
+    <w:p>
+      <w:pPr>
+        <w:spacing w:before="200" w:after="90" w:line="264" w:lineRule="auto"/>
+        <w:keepNext/>
+      </w:pPr>
+      <w:r>
+        <w:rPr>
+          <w:rFonts w:ascii="Calibri" w:hAnsi="Calibri" w:cs="Calibri"/>
+          <w:b/>
+          <w:sz w:val="24"/>
+          <w:szCs w:val="24"/>
+          <w:color w:val="0B5394"/>
+        </w:rPr>
+        <w:t xml:space="preserve">Référencement IA mensuel</w:t>
+      </w:r>
+    </w:p>
+    <w:tbl>
+      <w:tblPr>
+        <w:tblW w:w="9638" w:type="dxa"/>
+        <w:tblLayout w:type="fixed"/>
+        <w:tblBorders>
+          <w:top w:val="single" w:sz="4" w:space="0" w:color="BFBFBF"/>
+          <w:left w:val="single" w:sz="4" w:space="0" w:color="BFBFBF"/>
+          <w:bottom w:val="single" w:sz="4" w:space="0" w:color="BFBFBF"/>
+          <w:right w:val="single" w:sz="4" w:space="0" w:color="BFBFBF"/>
+          <w:insideH w:val="single" w:sz="4" w:space="0" w:color="BFBFBF"/>
+          <w:insideV w:val="single" w:sz="4" w:space="0" w:color="BFBFBF"/>
+        </w:tblBorders>
+        <w:tblCellMar>
+          <w:top w:w="60" w:type="dxa"/>
+          <w:left w:w="100" w:type="dxa"/>
+          <w:bottom w:w="60" w:type="dxa"/>
+          <w:right w:w="100" w:type="dxa"/>
+        </w:tblCellMar>
+      </w:tblPr>
+      <w:tblGrid>
+        <w:gridCol w:w="2500"/>
+        <w:gridCol w:w="5238"/>
+        <w:gridCol w:w="1900"/>
+      </w:tblGrid>
+      <w:tr>
+        <w:tc>
+          <w:tcPr>
+            <w:tcW w:w="2500" w:type="dxa"/>
+            <w:shd w:val="clear" w:color="auto" w:fill="003764"/>
+            <w:vAlign w:val="center"/>
+          </w:tcPr>
+          <w:p>
+            <w:pPr>
+              <w:spacing w:before="0" w:after="20" w:line="264" w:lineRule="auto"/>
+            </w:pPr>
+            <w:r>
+              <w:rPr>
+                <w:rFonts w:ascii="Calibri" w:hAnsi="Calibri" w:cs="Calibri"/>
+                <w:b/>
+                <w:sz w:val="20"/>
+                <w:szCs w:val="20"/>
+                <w:color w:val="FFFFFF"/>
+              </w:rPr>
+              <w:t xml:space="preserve">Formule</w:t>
+            </w:r>
+          </w:p>
+        </w:tc>
+        <w:tc>
+          <w:tcPr>
+            <w:tcW w:w="5238" w:type="dxa"/>
+            <w:shd w:val="clear" w:color="auto" w:fill="003764"/>
+            <w:vAlign w:val="center"/>
+          </w:tcPr>
+          <w:p>
+            <w:pPr>
+              <w:spacing w:before="0" w:after="20" w:line="264" w:lineRule="auto"/>
+            </w:pPr>
+            <w:r>
+              <w:rPr>
+                <w:rFonts w:ascii="Calibri" w:hAnsi="Calibri" w:cs="Calibri"/>
+                <w:b/>
+                <w:sz w:val="20"/>
+                <w:szCs w:val="20"/>
+                <w:color w:val="FFFFFF"/>
+              </w:rPr>
+              <w:t xml:space="preserve">Chaque mois</w:t>
+            </w:r>
+          </w:p>
+        </w:tc>
+        <w:tc>
+          <w:tcPr>
+            <w:tcW w:w="1900" w:type="dxa"/>
+            <w:shd w:val="clear" w:color="auto" w:fill="003764"/>
+            <w:vAlign w:val="center"/>
+          </w:tcPr>
+          <w:p>
+            <w:pPr>
+              <w:spacing w:before="0" w:after="20" w:line="264" w:lineRule="auto"/>
+              <w:jc w:val="right"/>
+            </w:pPr>
+            <w:r>
+              <w:rPr>
+                <w:rFonts w:ascii="Calibri" w:hAnsi="Calibri" w:cs="Calibri"/>
+                <w:b/>
+                <w:sz w:val="20"/>
+                <w:szCs w:val="20"/>
+                <w:color w:val="FFFFFF"/>
+              </w:rPr>
+              <w:t xml:space="preserve">Tarif HT</w:t>
+            </w:r>
+          </w:p>
+        </w:tc>
+      </w:tr>
+      <w:tr>
+        <w:tc>
+          <w:tcPr>
+            <w:tcW w:w="2500" w:type="dxa"/>
+            <w:vAlign w:val="center"/>
+          </w:tcPr>
+          <w:p>
+            <w:pPr>
+              <w:spacing w:before="0" w:after="20" w:line="264" w:lineRule="auto"/>
+            </w:pPr>
+            <w:r>
+              <w:rPr>
+                <w:rFonts w:ascii="Calibri" w:hAnsi="Calibri" w:cs="Calibri"/>
+                <w:b/>
+                <w:sz w:val="20"/>
+                <w:szCs w:val="20"/>
+              </w:rPr>
+              <w:t xml:space="preserve">Suivi</w:t>
+            </w:r>
+          </w:p>
+        </w:tc>
+        <w:tc>
+          <w:tcPr>
+            <w:tcW w:w="5238" w:type="dxa"/>
+            <w:vAlign w:val="center"/>
+          </w:tcPr>
+          <w:p>
+            <w:pPr>
+              <w:spacing w:before="0" w:after="20" w:line="264" w:lineRule="auto"/>
+            </w:pPr>
+            <w:r>
+              <w:rPr>
+                <w:rFonts w:ascii="Calibri" w:hAnsi="Calibri" w:cs="Calibri"/>
+                <w:sz w:val="19"/>
+                <w:szCs w:val="19"/>
+              </w:rPr>
+              <w:t xml:space="preserve">Les vingt mêmes questions reposées sur quatre moteurs, trois passages chacun ; tableau de bord en français (citations, concurrents cités, sources) ; 30 minutes d’échange en visio.</w:t>
+            </w:r>
+          </w:p>
+        </w:tc>
+        <w:tc>
+          <w:tcPr>
+            <w:tcW w:w="1900" w:type="dxa"/>
+            <w:shd w:val="clear" w:color="auto" w:fill="F2F2F2"/>
+            <w:vAlign w:val="center"/>
+          </w:tcPr>
+          <w:p>
+            <w:pPr>
+              <w:spacing w:before="0" w:after="20" w:line="264" w:lineRule="auto"/>
+              <w:jc w:val="right"/>
+            </w:pPr>
+            <w:r>
+              <w:rPr>
+                <w:rFonts w:ascii="Calibri" w:hAnsi="Calibri" w:cs="Calibri"/>
+                <w:b/>
+                <w:sz w:val="20"/>
+                <w:szCs w:val="20"/>
+                <w:color w:val="003764"/>
+              </w:rPr>
+              <w:t xml:space="preserve">290 €/mois</w:t>
+            </w:r>
+          </w:p>
+        </w:tc>
+      </w:tr>
+      <w:tr>
+        <w:tc>
+          <w:tcPr>
+            <w:tcW w:w="2500" w:type="dxa"/>
+            <w:vAlign w:val="center"/>
+          </w:tcPr>
+          <w:p>
+            <w:pPr>
+              <w:spacing w:before="0" w:after="20" w:line="264" w:lineRule="auto"/>
+            </w:pPr>
+            <w:r>
+              <w:rPr>
+                <w:rFonts w:ascii="Calibri" w:hAnsi="Calibri" w:cs="Calibri"/>
+                <w:b/>
+                <w:sz w:val="20"/>
+                <w:szCs w:val="20"/>
+              </w:rPr>
+              <w:t xml:space="preserve">Accompagnement</w:t>
+            </w:r>
+          </w:p>
+        </w:tc>
+        <w:tc>
+          <w:tcPr>
+            <w:tcW w:w="5238" w:type="dxa"/>
+            <w:vAlign w:val="center"/>
+          </w:tcPr>
+          <w:p>
+            <w:pPr>
+              <w:spacing w:before="0" w:after="20" w:line="264" w:lineRule="auto"/>
+            </w:pPr>
+            <w:r>
+              <w:rPr>
+                <w:rFonts w:ascii="Calibri" w:hAnsi="Calibri" w:cs="Calibri"/>
+                <w:sz w:val="19"/>
+                <w:szCs w:val="19"/>
+              </w:rPr>
+              <w:t xml:space="preserve">Le suivi, plus une page réponse ou un contenu citable (chiffres sourcés), les corrections techniques qui en découlent, une action sur les sites tiers que les IA lisent, le SEO de base compris.</w:t>
+            </w:r>
+          </w:p>
+        </w:tc>
+        <w:tc>
+          <w:tcPr>
+            <w:tcW w:w="1900" w:type="dxa"/>
+            <w:shd w:val="clear" w:color="auto" w:fill="F2F2F2"/>
+            <w:vAlign w:val="center"/>
+          </w:tcPr>
+          <w:p>
+            <w:pPr>
+              <w:spacing w:before="0" w:after="20" w:line="264" w:lineRule="auto"/>
+              <w:jc w:val="right"/>
+            </w:pPr>
+            <w:r>
+              <w:rPr>
+                <w:rFonts w:ascii="Calibri" w:hAnsi="Calibri" w:cs="Calibri"/>
+                <w:b/>
+                <w:sz w:val="20"/>
+                <w:szCs w:val="20"/>
+                <w:color w:val="003764"/>
+              </w:rPr>
+              <w:t xml:space="preserve">790 €/mois</w:t>
+            </w:r>
+          </w:p>
+        </w:tc>
+      </w:tr>
+    </w:tbl>
+    <w:p>
+      <w:pPr>
+        <w:spacing w:before="0" w:after="100" w:line="264" w:lineRule="auto"/>
+      </w:pPr>
+      <w:r>
+        <w:rPr>
+          <w:rFonts w:ascii="Calibri" w:hAnsi="Calibri" w:cs="Calibri"/>
+          <w:i/>
+          <w:sz w:val="18"/>
+          <w:szCs w:val="18"/>
+          <w:color w:val="595959"/>
+        </w:rPr>
+        <w:t xml:space="preserve">Sans engagement de durée, préavis de 30 jours. L’audit est déduit de votre première facture si un accompagnement démarre dans les 30 jours. Aucune garantie d’être cité : les moteurs changent de réponse d’un appel à l’autre, et personne ne contrôle leurs choix. Ce qui est garanti, c’est une mesure honnête, refaite à l’identique chaque mois.</w:t>
+      </w:r>
+    </w:p>
     <w:p>
       <w:pPr>
         <w:spacing w:before="0" w:after="60" w:line="264" w:lineRule="auto"/>
@@ -2738,7 +2927,7 @@
           <w:sz w:val="21"/>
           <w:szCs w:val="21"/>
         </w:rPr>
-        <w:t xml:space="preserve">Ces tarifs sont posés en connaissance du marché français, sources publiques à l’appui. Les fourchettes ci-dessous ont été relevées le 18 août 2026.</w:t>
+        <w:t xml:space="preserve">Ces tarifs sont posés en connaissance du marché français, sources publiques à l’appui. Les fourchettes ci-dessous ont été relevées le 18 août 2026, et le 30 septembre 2026 pour le référencement IA.</w:t>
       </w:r>
     </w:p>
     <w:tbl>
@@ -3085,7 +3274,7 @@
                 <w:szCs w:val="20"/>
                 <w:color w:val="003764"/>
               </w:rPr>
-              <w:t xml:space="preserve">390 à 1 190 €/mois</w:t>
+              <w:t xml:space="preserve">390 à 690 €/mois</w:t>
             </w:r>
           </w:p>
         </w:tc>
@@ -3190,7 +3379,7 @@
                 <w:sz w:val="19"/>
                 <w:szCs w:val="19"/>
               </w:rPr>
-              <w:t xml:space="preserve">1 500 à 3 000 € chez les agences GEO (relevés 2026, marché jeune et peu standardisé).</w:t>
+              <w:t xml:space="preserve">1 200 € chez un consultant indépendant (relevé de septembre 2026) ; 1 500 à 3 000 € chez les agences GEO (relevés 2026, marché jeune et peu standardisé).</w:t>
             </w:r>
           </w:p>
         </w:tc>
@@ -3213,7 +3402,71 @@
                 <w:szCs w:val="20"/>
                 <w:color w:val="003764"/>
               </w:rPr>
-              <w:t xml:space="preserve">490 €</w:t>
+              <w:t xml:space="preserve">790 €</w:t>
+            </w:r>
+          </w:p>
+        </w:tc>
+      </w:tr>
+      <w:tr>
+        <w:tc>
+          <w:tcPr>
+            <w:tcW w:w="2300" w:type="dxa"/>
+            <w:vAlign w:val="center"/>
+          </w:tcPr>
+          <w:p>
+            <w:pPr>
+              <w:spacing w:before="0" w:after="20" w:line="264" w:lineRule="auto"/>
+            </w:pPr>
+            <w:r>
+              <w:rPr>
+                <w:rFonts w:ascii="Calibri" w:hAnsi="Calibri" w:cs="Calibri"/>
+                <w:b/>
+                <w:sz w:val="20"/>
+                <w:szCs w:val="20"/>
+              </w:rPr>
+              <w:t xml:space="preserve">Référencement IA mensuel</w:t>
+            </w:r>
+          </w:p>
+        </w:tc>
+        <w:tc>
+          <w:tcPr>
+            <w:tcW w:w="5138" w:type="dxa"/>
+            <w:vAlign w:val="center"/>
+          </w:tcPr>
+          <w:p>
+            <w:pPr>
+              <w:spacing w:before="0" w:after="20" w:line="264" w:lineRule="auto"/>
+            </w:pPr>
+            <w:r>
+              <w:rPr>
+                <w:rFonts w:ascii="Calibri" w:hAnsi="Calibri" w:cs="Calibri"/>
+                <w:sz w:val="19"/>
+                <w:szCs w:val="19"/>
+              </w:rPr>
+              <w:t xml:space="preserve">800 à 2 000 €/mois chez un consultant indépendant, 800 à 3 000 €/mois en agence (relevés de septembre 2026).</w:t>
+            </w:r>
+          </w:p>
+        </w:tc>
+        <w:tc>
+          <w:tcPr>
+            <w:tcW w:w="2200" w:type="dxa"/>
+            <w:shd w:val="clear" w:color="auto" w:fill="F2F2F2"/>
+            <w:vAlign w:val="center"/>
+          </w:tcPr>
+          <w:p>
+            <w:pPr>
+              <w:spacing w:before="0" w:after="20" w:line="264" w:lineRule="auto"/>
+              <w:jc w:val="right"/>
+            </w:pPr>
+            <w:r>
+              <w:rPr>
+                <w:rFonts w:ascii="Calibri" w:hAnsi="Calibri" w:cs="Calibri"/>
+                <w:b/>
+                <w:sz w:val="20"/>
+                <w:szCs w:val="20"/>
+                <w:color w:val="003764"/>
+              </w:rPr>
+              <w:t xml:space="preserve">290 à 790 €/mois</w:t>
             </w:r>
           </w:p>
         </w:tc>

</xml_diff>

<commit_message>
tarifs : une seule grille mensuelle Google + IA (Suivi 290, Essentiel 590, Croissance 890)
L'accompagnement SEO (390 et 690, suivi IA en option à +200) et
l'accompagnement référencement IA (790) vendaient le même travail sous
deux noms. Une seule grille les remplace, la mesure Google et IA comprise
à chaque palier : section 04 de /tarifs/ (sommaire, OfferCatalog, meta,
ligne du tableau de marché), cartes de l'accueil et de /services/,
llms.txt, llms-full.txt et plaquette DOCX. Badge « La plus choisie »
retiré, faute de mesure. lastmod de /tarifs/ au 21/10/2026.

Générateur de la plaquette : espace insécable dans les milliers, gardes
qui refusent toute trace de l'ancienne grille.

Co-Authored-By: Claude Opus 5.5 <noreply@anthropic.com>
</commit_message>
<xml_diff>
--- a/_tarifs/Plaquette-Tarifs-MKZ-2026.docx
+++ b/_tarifs/Plaquette-Tarifs-MKZ-2026.docx
@@ -655,7 +655,7 @@
                 <w:szCs w:val="20"/>
                 <w:color w:val="003764"/>
               </w:rPr>
-              <w:t xml:space="preserve">1 490 €</w:t>
+              <w:t xml:space="preserve">1 490 €</w:t>
             </w:r>
           </w:p>
         </w:tc>
@@ -719,7 +719,7 @@
                 <w:szCs w:val="20"/>
                 <w:color w:val="003764"/>
               </w:rPr>
-              <w:t xml:space="preserve">2 490 €</w:t>
+              <w:t xml:space="preserve">2 490 €</w:t>
             </w:r>
           </w:p>
         </w:tc>
@@ -783,7 +783,7 @@
                 <w:szCs w:val="20"/>
                 <w:color w:val="003764"/>
               </w:rPr>
-              <w:t xml:space="preserve">à partir de 2 990 €</w:t>
+              <w:t xml:space="preserve">à partir de 2 990 €</w:t>
             </w:r>
           </w:p>
         </w:tc>
@@ -1689,7 +1689,7 @@
                 <w:sz w:val="19"/>
                 <w:szCs w:val="19"/>
               </w:rPr>
-              <w:t xml:space="preserve">Les deux audits ensemble : Google d’un côté, ChatGPT, Perplexity, Gemini et les aperçus IA de Google de l’autre (détail en partie 3). 1 280 € séparément.</w:t>
+              <w:t xml:space="preserve">Les deux audits ensemble : Google d’un côté, ChatGPT, Perplexity, Gemini et les aperçus IA de Google de l’autre (détail en partie 3). 1 280 € séparément.</w:t>
             </w:r>
           </w:p>
         </w:tc>
@@ -1712,7 +1712,7 @@
                 <w:szCs w:val="20"/>
                 <w:color w:val="003764"/>
               </w:rPr>
-              <w:t xml:space="preserve">1 090 €</w:t>
+              <w:t xml:space="preserve">1 090 €</w:t>
             </w:r>
           </w:p>
         </w:tc>
@@ -1858,7 +1858,7 @@
           <w:szCs w:val="18"/>
           <w:color w:val="595959"/>
         </w:rPr>
-        <w:t xml:space="preserve">L’audit est déduit de votre première facture si vous démarrez un accompagnement dans les 30 jours qui suivent sa restitution.</w:t>
+        <w:t xml:space="preserve">L’audit est déduit de votre première facture si vous démarrez un accompagnement (partie 4) dans les 30 jours qui suivent sa restitution.</w:t>
       </w:r>
     </w:p>
     <w:p>
@@ -1874,7 +1874,149 @@
           <w:szCs w:val="24"/>
           <w:color w:val="0B5394"/>
         </w:rPr>
-        <w:t xml:space="preserve">Accompagnement SEO mensuel</w:t>
+        <w:t xml:space="preserve">À la carte</w:t>
+      </w:r>
+    </w:p>
+    <w:p>
+      <w:pPr>
+        <w:spacing w:before="0" w:after="60" w:line="264" w:lineRule="auto"/>
+        <w:ind w:left="340" w:hanging="227"/>
+      </w:pPr>
+      <w:r>
+        <w:rPr>
+          <w:rFonts w:ascii="Calibri" w:hAnsi="Calibri" w:cs="Calibri"/>
+          <w:sz w:val="21"/>
+          <w:szCs w:val="21"/>
+        </w:rPr>
+        <w:t xml:space="preserve">•  </w:t>
+      </w:r>
+      <w:r>
+        <w:rPr>
+          <w:rFonts w:ascii="Calibri" w:hAnsi="Calibri" w:cs="Calibri"/>
+          <w:b/>
+          <w:sz w:val="21"/>
+          <w:szCs w:val="21"/>
+        </w:rPr>
+        <w:t xml:space="preserve">Article SEO à l’unité</w:t>
+      </w:r>
+      <w:r>
+        <w:rPr>
+          <w:rFonts w:ascii="Calibri" w:hAnsi="Calibri" w:cs="Calibri"/>
+          <w:sz w:val="21"/>
+          <w:szCs w:val="21"/>
+        </w:rPr>
+        <w:t xml:space="preserve"> : 1 200 mots et plus, mots-clés mesurés, maillage interne, balisage complet : </w:t>
+      </w:r>
+      <w:r>
+        <w:rPr>
+          <w:rFonts w:ascii="Calibri" w:hAnsi="Calibri" w:cs="Calibri"/>
+          <w:b/>
+          <w:sz w:val="21"/>
+          <w:szCs w:val="21"/>
+        </w:rPr>
+        <w:t xml:space="preserve">199 €</w:t>
+      </w:r>
+      <w:r>
+        <w:rPr>
+          <w:rFonts w:ascii="Calibri" w:hAnsi="Calibri" w:cs="Calibri"/>
+          <w:sz w:val="21"/>
+          <w:szCs w:val="21"/>
+        </w:rPr>
+        <w:t xml:space="preserve">.</w:t>
+      </w:r>
+    </w:p>
+    <w:p>
+      <w:pPr>
+        <w:spacing w:before="0" w:after="60" w:line="264" w:lineRule="auto"/>
+        <w:ind w:left="340" w:hanging="227"/>
+      </w:pPr>
+      <w:r>
+        <w:rPr>
+          <w:rFonts w:ascii="Calibri" w:hAnsi="Calibri" w:cs="Calibri"/>
+          <w:sz w:val="21"/>
+          <w:szCs w:val="21"/>
+        </w:rPr>
+        <w:t xml:space="preserve">•  </w:t>
+      </w:r>
+      <w:r>
+        <w:rPr>
+          <w:rFonts w:ascii="Calibri" w:hAnsi="Calibri" w:cs="Calibri"/>
+          <w:b/>
+          <w:sz w:val="21"/>
+          <w:szCs w:val="21"/>
+        </w:rPr>
+        <w:t xml:space="preserve">Netlinking en toute transparence</w:t>
+      </w:r>
+      <w:r>
+        <w:rPr>
+          <w:rFonts w:ascii="Calibri" w:hAnsi="Calibri" w:cs="Calibri"/>
+          <w:sz w:val="21"/>
+          <w:szCs w:val="21"/>
+        </w:rPr>
+        <w:t xml:space="preserve"> : chaque lien est choisi à la main, son prix d’achat vous est refacturé à l’euro près, plus </w:t>
+      </w:r>
+      <w:r>
+        <w:rPr>
+          <w:rFonts w:ascii="Calibri" w:hAnsi="Calibri" w:cs="Calibri"/>
+          <w:b/>
+          <w:sz w:val="21"/>
+          <w:szCs w:val="21"/>
+        </w:rPr>
+        <w:t xml:space="preserve">70 € de sélection et de pose par lien</w:t>
+      </w:r>
+      <w:r>
+        <w:rPr>
+          <w:rFonts w:ascii="Calibri" w:hAnsi="Calibri" w:cs="Calibri"/>
+          <w:sz w:val="21"/>
+          <w:szCs w:val="21"/>
+        </w:rPr>
+        <w:t xml:space="preserve">. Budget conseillé : 150 à 500 € par mois selon la concurrence de votre secteur.</w:t>
+      </w:r>
+    </w:p>
+    <w:p>
+      <w:pPr>
+        <w:spacing w:before="260" w:after="120" w:line="264" w:lineRule="auto"/>
+        <w:keepNext/>
+      </w:pPr>
+      <w:r>
+        <w:rPr>
+          <w:rFonts w:ascii="Calibri" w:hAnsi="Calibri" w:cs="Calibri"/>
+          <w:b/>
+          <w:sz w:val="30"/>
+          <w:szCs w:val="30"/>
+          <w:color w:val="003764"/>
+        </w:rPr>
+        <w:t xml:space="preserve">3. Être cité par les IA (référencement IA / GEO)</w:t>
+      </w:r>
+    </w:p>
+    <w:p>
+      <w:pPr>
+        <w:spacing w:before="0" w:after="100" w:line="264" w:lineRule="auto"/>
+      </w:pPr>
+      <w:r>
+        <w:rPr>
+          <w:rFonts w:ascii="Calibri" w:hAnsi="Calibri" w:cs="Calibri"/>
+          <w:sz w:val="21"/>
+          <w:szCs w:val="21"/>
+        </w:rPr>
+        <w:t xml:space="preserve">Vos clients posent déjà leurs questions à ChatGPT ou Perplexity. Le référencement IA, aussi appelé GEO, consiste à faire de votre entreprise </w:t>
+      </w:r>
+      <w:r>
+        <w:rPr>
+          <w:rFonts w:ascii="Calibri" w:hAnsi="Calibri" w:cs="Calibri"/>
+          <w:b/>
+          <w:sz w:val="21"/>
+          <w:szCs w:val="21"/>
+        </w:rPr>
+        <w:t xml:space="preserve">la réponse que ces moteurs citent</w:t>
+      </w:r>
+      <w:r>
+        <w:rPr>
+          <w:rFonts w:ascii="Calibri" w:hAnsi="Calibri" w:cs="Calibri"/>
+          <w:sz w:val="21"/>
+          <w:szCs w:val="21"/>
+        </w:rPr>
+        <w:t xml:space="preserve">. Trouvé sur Google, cité par les IA : chaque résultat est mesuré, pas promis. Dans l’accompagnement mensuel (partie 4), les mêmes questions sont reposées chaque mois, à l’identique, et le tableau dit ce qui a bougé.</w:t>
       </w:r>
     </w:p>
     <w:tbl>
@@ -1920,7 +2062,7 @@
                 <w:szCs w:val="20"/>
                 <w:color w:val="FFFFFF"/>
               </w:rPr>
-              <w:t xml:space="preserve">Formule</w:t>
+              <w:t xml:space="preserve">Prestation</w:t>
             </w:r>
           </w:p>
         </w:tc>
@@ -1942,7 +2084,7 @@
                 <w:szCs w:val="20"/>
                 <w:color w:val="FFFFFF"/>
               </w:rPr>
-              <w:t xml:space="preserve">Chaque mois</w:t>
+              <w:t xml:space="preserve">Ce que vous recevez</w:t>
             </w:r>
           </w:p>
         </w:tc>
@@ -1987,7 +2129,7 @@
                 <w:sz w:val="20"/>
                 <w:szCs w:val="20"/>
               </w:rPr>
-              <w:t xml:space="preserve">Fondations</w:t>
+              <w:t xml:space="preserve">Test « Votre nom sort-il ? »</w:t>
             </w:r>
           </w:p>
         </w:tc>
@@ -2006,7 +2148,7 @@
                 <w:sz w:val="19"/>
                 <w:szCs w:val="19"/>
               </w:rPr>
-              <w:t xml:space="preserve">1 article optimisé, optimisations continues du site, suivi des positions, rapport chiffré.</w:t>
+              <w:t xml:space="preserve">Cinq questions qu’un de vos clients poserait, posées à ChatGPT et à Perplexity. Sous 48 h ouvrées, une page : votre nom sort-il, qui sort à votre place, et quelles pages ces moteurs lisent pour répondre.</w:t>
             </w:r>
           </w:p>
         </w:tc>
@@ -2029,7 +2171,7 @@
                 <w:szCs w:val="20"/>
                 <w:color w:val="003764"/>
               </w:rPr>
-              <w:t xml:space="preserve">390 €/mois</w:t>
+              <w:t xml:space="preserve">Gratuit</w:t>
             </w:r>
           </w:p>
         </w:tc>
@@ -2051,7 +2193,7 @@
                 <w:sz w:val="20"/>
                 <w:szCs w:val="20"/>
               </w:rPr>
-              <w:t xml:space="preserve">Croissance (la plus choisie)</w:t>
+              <w:t xml:space="preserve">Audit référencement IA</w:t>
             </w:r>
           </w:p>
         </w:tc>
@@ -2070,7 +2212,7 @@
                 <w:sz w:val="19"/>
                 <w:szCs w:val="19"/>
               </w:rPr>
-              <w:t xml:space="preserve">2 articles optimisés, 1 à 2 liens entrants de qualité, suivi de votre visibilité locale, 1 h de conseil en visio.</w:t>
+              <w:t xml:space="preserve">Vingt questions de vos clients, posées à ChatGPT, Perplexity, Gemini et aux aperçus IA de Google, trois fois chacune. Qui est cité à votre place et d’où vient chaque citation, accès des robots IA vérifié sur le site en ligne, contenus citables page par page, plan d’action sur 90 jours, restitution d’une heure en visio.</w:t>
             </w:r>
           </w:p>
         </w:tc>
@@ -2093,7 +2235,71 @@
                 <w:szCs w:val="20"/>
                 <w:color w:val="003764"/>
               </w:rPr>
-              <w:t xml:space="preserve">690 €/mois</w:t>
+              <w:t xml:space="preserve">790 €</w:t>
+            </w:r>
+          </w:p>
+        </w:tc>
+      </w:tr>
+      <w:tr>
+        <w:tc>
+          <w:tcPr>
+            <w:tcW w:w="2500" w:type="dxa"/>
+            <w:vAlign w:val="center"/>
+          </w:tcPr>
+          <w:p>
+            <w:pPr>
+              <w:spacing w:before="0" w:after="20" w:line="264" w:lineRule="auto"/>
+            </w:pPr>
+            <w:r>
+              <w:rPr>
+                <w:rFonts w:ascii="Calibri" w:hAnsi="Calibri" w:cs="Calibri"/>
+                <w:b/>
+                <w:sz w:val="20"/>
+                <w:szCs w:val="20"/>
+              </w:rPr>
+              <w:t xml:space="preserve">Socle technique IA</w:t>
+            </w:r>
+          </w:p>
+        </w:tc>
+        <w:tc>
+          <w:tcPr>
+            <w:tcW w:w="5238" w:type="dxa"/>
+            <w:vAlign w:val="center"/>
+          </w:tcPr>
+          <w:p>
+            <w:pPr>
+              <w:spacing w:before="0" w:after="20" w:line="264" w:lineRule="auto"/>
+            </w:pPr>
+            <w:r>
+              <w:rPr>
+                <w:rFonts w:ascii="Calibri" w:hAnsi="Calibri" w:cs="Calibri"/>
+                <w:sz w:val="19"/>
+                <w:szCs w:val="19"/>
+              </w:rPr>
+              <w:t xml:space="preserve">Fichier llms.txt, données structurées, robots IA autorisés, données chiffrées citables. Déjà inclus dans tout site créé par MKZ.</w:t>
+            </w:r>
+          </w:p>
+        </w:tc>
+        <w:tc>
+          <w:tcPr>
+            <w:tcW w:w="1900" w:type="dxa"/>
+            <w:shd w:val="clear" w:color="auto" w:fill="F2F2F2"/>
+            <w:vAlign w:val="center"/>
+          </w:tcPr>
+          <w:p>
+            <w:pPr>
+              <w:spacing w:before="0" w:after="20" w:line="264" w:lineRule="auto"/>
+              <w:jc w:val="right"/>
+            </w:pPr>
+            <w:r>
+              <w:rPr>
+                <w:rFonts w:ascii="Calibri" w:hAnsi="Calibri" w:cs="Calibri"/>
+                <w:b/>
+                <w:sz w:val="20"/>
+                <w:szCs w:val="20"/>
+                <w:color w:val="003764"/>
+              </w:rPr>
+              <w:t xml:space="preserve">390 €</w:t>
             </w:r>
           </w:p>
         </w:tc>
@@ -2111,119 +2317,7 @@
           <w:szCs w:val="18"/>
           <w:color w:val="595959"/>
         </w:rPr>
-        <w:t xml:space="preserve">Sans engagement de durée, préavis de 30 jours. Le référencement est un travail de fond : comptez 6 mois pour des résultats solides. Nous vous le disons avant de facturer, pas après. Le suivi mensuel des citations IA s’ajoute à l’une ou l’autre formule pour 200 € HT par mois.</w:t>
-      </w:r>
-    </w:p>
-    <w:p>
-      <w:pPr>
-        <w:spacing w:before="200" w:after="90" w:line="264" w:lineRule="auto"/>
-        <w:keepNext/>
-      </w:pPr>
-      <w:r>
-        <w:rPr>
-          <w:rFonts w:ascii="Calibri" w:hAnsi="Calibri" w:cs="Calibri"/>
-          <w:b/>
-          <w:sz w:val="24"/>
-          <w:szCs w:val="24"/>
-          <w:color w:val="0B5394"/>
-        </w:rPr>
-        <w:t xml:space="preserve">À la carte</w:t>
-      </w:r>
-    </w:p>
-    <w:p>
-      <w:pPr>
-        <w:spacing w:before="0" w:after="60" w:line="264" w:lineRule="auto"/>
-        <w:ind w:left="340" w:hanging="227"/>
-      </w:pPr>
-      <w:r>
-        <w:rPr>
-          <w:rFonts w:ascii="Calibri" w:hAnsi="Calibri" w:cs="Calibri"/>
-          <w:sz w:val="21"/>
-          <w:szCs w:val="21"/>
-        </w:rPr>
-        <w:t xml:space="preserve">•  </w:t>
-      </w:r>
-      <w:r>
-        <w:rPr>
-          <w:rFonts w:ascii="Calibri" w:hAnsi="Calibri" w:cs="Calibri"/>
-          <w:b/>
-          <w:sz w:val="21"/>
-          <w:szCs w:val="21"/>
-        </w:rPr>
-        <w:t xml:space="preserve">Article SEO à l’unité</w:t>
-      </w:r>
-      <w:r>
-        <w:rPr>
-          <w:rFonts w:ascii="Calibri" w:hAnsi="Calibri" w:cs="Calibri"/>
-          <w:sz w:val="21"/>
-          <w:szCs w:val="21"/>
-        </w:rPr>
-        <w:t xml:space="preserve"> : 1 200 mots et plus, mots-clés mesurés, maillage interne, balisage complet : </w:t>
-      </w:r>
-      <w:r>
-        <w:rPr>
-          <w:rFonts w:ascii="Calibri" w:hAnsi="Calibri" w:cs="Calibri"/>
-          <w:b/>
-          <w:sz w:val="21"/>
-          <w:szCs w:val="21"/>
-        </w:rPr>
-        <w:t xml:space="preserve">199 €</w:t>
-      </w:r>
-      <w:r>
-        <w:rPr>
-          <w:rFonts w:ascii="Calibri" w:hAnsi="Calibri" w:cs="Calibri"/>
-          <w:sz w:val="21"/>
-          <w:szCs w:val="21"/>
-        </w:rPr>
-        <w:t xml:space="preserve">.</w:t>
-      </w:r>
-    </w:p>
-    <w:p>
-      <w:pPr>
-        <w:spacing w:before="0" w:after="60" w:line="264" w:lineRule="auto"/>
-        <w:ind w:left="340" w:hanging="227"/>
-      </w:pPr>
-      <w:r>
-        <w:rPr>
-          <w:rFonts w:ascii="Calibri" w:hAnsi="Calibri" w:cs="Calibri"/>
-          <w:sz w:val="21"/>
-          <w:szCs w:val="21"/>
-        </w:rPr>
-        <w:t xml:space="preserve">•  </w:t>
-      </w:r>
-      <w:r>
-        <w:rPr>
-          <w:rFonts w:ascii="Calibri" w:hAnsi="Calibri" w:cs="Calibri"/>
-          <w:b/>
-          <w:sz w:val="21"/>
-          <w:szCs w:val="21"/>
-        </w:rPr>
-        <w:t xml:space="preserve">Netlinking en toute transparence</w:t>
-      </w:r>
-      <w:r>
-        <w:rPr>
-          <w:rFonts w:ascii="Calibri" w:hAnsi="Calibri" w:cs="Calibri"/>
-          <w:sz w:val="21"/>
-          <w:szCs w:val="21"/>
-        </w:rPr>
-        <w:t xml:space="preserve"> : chaque lien est choisi à la main, son prix d’achat vous est refacturé à l’euro près, plus </w:t>
-      </w:r>
-      <w:r>
-        <w:rPr>
-          <w:rFonts w:ascii="Calibri" w:hAnsi="Calibri" w:cs="Calibri"/>
-          <w:b/>
-          <w:sz w:val="21"/>
-          <w:szCs w:val="21"/>
-        </w:rPr>
-        <w:t xml:space="preserve">70 € de sélection et de pose par lien</w:t>
-      </w:r>
-      <w:r>
-        <w:rPr>
-          <w:rFonts w:ascii="Calibri" w:hAnsi="Calibri" w:cs="Calibri"/>
-          <w:sz w:val="21"/>
-          <w:szCs w:val="21"/>
-        </w:rPr>
-        <w:t xml:space="preserve">. Budget conseillé : 150 à 500 € par mois selon la concurrence de votre secteur.</w:t>
+        <w:t xml:space="preserve">L’audit est déduit de votre première facture si un accompagnement démarre dans les 30 jours.</w:t>
       </w:r>
     </w:p>
     <w:p>
@@ -2239,7 +2333,7 @@
           <w:szCs w:val="30"/>
           <w:color w:val="003764"/>
         </w:rPr>
-        <w:t xml:space="preserve">3. Être cité par les IA (référencement IA / GEO)</w:t>
+        <w:t xml:space="preserve">4. Accompagnement mensuel : trouvé sur Google, cité par les IA</w:t>
       </w:r>
     </w:p>
     <w:p>
@@ -2252,7 +2346,7 @@
           <w:sz w:val="21"/>
           <w:szCs w:val="21"/>
         </w:rPr>
-        <w:t xml:space="preserve">Vos clients posent déjà leurs questions à ChatGPT ou Perplexity. Le référencement IA, aussi appelé GEO, consiste à faire de votre entreprise </w:t>
+        <w:t xml:space="preserve">Une seule formule pour les deux, parce que le travail est le même : des contenus qui répondent clairement, avec des chiffres sourcés et datés, un site techniquement propre, des mentions sur les sites que Google et les IA lisent. Ce qui change, c’est ce qu’on mesure. </w:t>
       </w:r>
       <w:r>
         <w:rPr>
@@ -2261,15 +2355,15 @@
           <w:sz w:val="21"/>
           <w:szCs w:val="21"/>
         </w:rPr>
-        <w:t xml:space="preserve">la réponse que ces moteurs citent</w:t>
-      </w:r>
-      <w:r>
-        <w:rPr>
-          <w:rFonts w:ascii="Calibri" w:hAnsi="Calibri" w:cs="Calibri"/>
-          <w:sz w:val="21"/>
-          <w:szCs w:val="21"/>
-        </w:rPr>
-        <w:t xml:space="preserve">. Trouvé sur Google, cité par les IA : chaque résultat est mesuré, pas promis. Les mêmes questions sont reposées chaque mois, à l’identique, et le tableau dit ce qui a bougé.</w:t>
+        <w:t xml:space="preserve">Chaque formule mesure les deux</w:t>
+      </w:r>
+      <w:r>
+        <w:rPr>
+          <w:rFonts w:ascii="Calibri" w:hAnsi="Calibri" w:cs="Calibri"/>
+          <w:sz w:val="21"/>
+          <w:szCs w:val="21"/>
+        </w:rPr>
+        <w:t xml:space="preserve">, chaque mois, à l’identique : vos positions et vos clics sur Google, vos citations par ChatGPT, Perplexity, Gemini et les aperçus IA de Google.</w:t>
       </w:r>
     </w:p>
     <w:tbl>
@@ -2315,7 +2409,7 @@
                 <w:szCs w:val="20"/>
                 <w:color w:val="FFFFFF"/>
               </w:rPr>
-              <w:t xml:space="preserve">Prestation</w:t>
+              <w:t xml:space="preserve">Formule</w:t>
             </w:r>
           </w:p>
         </w:tc>
@@ -2337,7 +2431,7 @@
                 <w:szCs w:val="20"/>
                 <w:color w:val="FFFFFF"/>
               </w:rPr>
-              <w:t xml:space="preserve">Ce que vous recevez</w:t>
+              <w:t xml:space="preserve">Chaque mois</w:t>
             </w:r>
           </w:p>
         </w:tc>
@@ -2382,7 +2476,7 @@
                 <w:sz w:val="20"/>
                 <w:szCs w:val="20"/>
               </w:rPr>
-              <w:t xml:space="preserve">Test « Votre nom sort-il ? »</w:t>
+              <w:t xml:space="preserve">Suivi</w:t>
             </w:r>
           </w:p>
         </w:tc>
@@ -2401,7 +2495,7 @@
                 <w:sz w:val="19"/>
                 <w:szCs w:val="19"/>
               </w:rPr>
-              <w:t xml:space="preserve">Cinq questions qu’un de vos clients poserait, posées à ChatGPT et à Perplexity. Sous 48 h ouvrées, une page : votre nom sort-il, qui sort à votre place, et quelles pages ces moteurs lisent pour répondre.</w:t>
+              <w:t xml:space="preserve">Vos positions et vos clics relevés dans votre Search Console ; vingt questions de vos clients posées à quatre moteurs IA, trois fois chacune ; tableau de bord en français (ce qui a bougé, qui est cité à votre place, d’où viennent les citations) ; 30 minutes d’échange en visio.</w:t>
             </w:r>
           </w:p>
         </w:tc>
@@ -2424,7 +2518,7 @@
                 <w:szCs w:val="20"/>
                 <w:color w:val="003764"/>
               </w:rPr>
-              <w:t xml:space="preserve">Gratuit</w:t>
+              <w:t xml:space="preserve">290 €/mois</w:t>
             </w:r>
           </w:p>
         </w:tc>
@@ -2446,7 +2540,7 @@
                 <w:sz w:val="20"/>
                 <w:szCs w:val="20"/>
               </w:rPr>
-              <w:t xml:space="preserve">Audit référencement IA</w:t>
+              <w:t xml:space="preserve">Essentiel</w:t>
             </w:r>
           </w:p>
         </w:tc>
@@ -2465,7 +2559,7 @@
                 <w:sz w:val="19"/>
                 <w:szCs w:val="19"/>
               </w:rPr>
-              <w:t xml:space="preserve">Vingt questions de vos clients, posées à ChatGPT, Perplexity, Gemini et aux aperçus IA de Google, trois fois chacune. Qui est cité à votre place et d’où vient chaque citation, accès des robots IA vérifié sur le site en ligne, contenus citables page par page, plan d’action sur 90 jours, restitution d’une heure en visio.</w:t>
+              <w:t xml:space="preserve">Tout le Suivi, plus un contenu par mois écrit pour Google et pour les IA, et les optimisations et corrections techniques continues.</w:t>
             </w:r>
           </w:p>
         </w:tc>
@@ -2488,7 +2582,7 @@
                 <w:szCs w:val="20"/>
                 <w:color w:val="003764"/>
               </w:rPr>
-              <w:t xml:space="preserve">790 €</w:t>
+              <w:t xml:space="preserve">590 €/mois</w:t>
             </w:r>
           </w:p>
         </w:tc>
@@ -2510,7 +2604,7 @@
                 <w:sz w:val="20"/>
                 <w:szCs w:val="20"/>
               </w:rPr>
-              <w:t xml:space="preserve">Socle technique IA</w:t>
+              <w:t xml:space="preserve">Croissance</w:t>
             </w:r>
           </w:p>
         </w:tc>
@@ -2529,7 +2623,7 @@
                 <w:sz w:val="19"/>
                 <w:szCs w:val="19"/>
               </w:rPr>
-              <w:t xml:space="preserve">Fichier llms.txt, données structurées, robots IA autorisés, données chiffrées citables. Déjà inclus dans tout site créé par MKZ.</w:t>
+              <w:t xml:space="preserve">Tout l’Essentiel, plus un deuxième contenu par mois, 1 à 2 liens ou mentions par mois sur des sites reconnus, le suivi de votre visibilité locale et 1 h de conseil en visio.</w:t>
             </w:r>
           </w:p>
         </w:tc>
@@ -2552,245 +2646,7 @@
                 <w:szCs w:val="20"/>
                 <w:color w:val="003764"/>
               </w:rPr>
-              <w:t xml:space="preserve">390 €</w:t>
-            </w:r>
-          </w:p>
-        </w:tc>
-      </w:tr>
-    </w:tbl>
-    <w:p>
-      <w:pPr>
-        <w:spacing w:before="200" w:after="90" w:line="264" w:lineRule="auto"/>
-        <w:keepNext/>
-      </w:pPr>
-      <w:r>
-        <w:rPr>
-          <w:rFonts w:ascii="Calibri" w:hAnsi="Calibri" w:cs="Calibri"/>
-          <w:b/>
-          <w:sz w:val="24"/>
-          <w:szCs w:val="24"/>
-          <w:color w:val="0B5394"/>
-        </w:rPr>
-        <w:t xml:space="preserve">Référencement IA mensuel</w:t>
-      </w:r>
-    </w:p>
-    <w:tbl>
-      <w:tblPr>
-        <w:tblW w:w="9638" w:type="dxa"/>
-        <w:tblLayout w:type="fixed"/>
-        <w:tblBorders>
-          <w:top w:val="single" w:sz="4" w:space="0" w:color="BFBFBF"/>
-          <w:left w:val="single" w:sz="4" w:space="0" w:color="BFBFBF"/>
-          <w:bottom w:val="single" w:sz="4" w:space="0" w:color="BFBFBF"/>
-          <w:right w:val="single" w:sz="4" w:space="0" w:color="BFBFBF"/>
-          <w:insideH w:val="single" w:sz="4" w:space="0" w:color="BFBFBF"/>
-          <w:insideV w:val="single" w:sz="4" w:space="0" w:color="BFBFBF"/>
-        </w:tblBorders>
-        <w:tblCellMar>
-          <w:top w:w="60" w:type="dxa"/>
-          <w:left w:w="100" w:type="dxa"/>
-          <w:bottom w:w="60" w:type="dxa"/>
-          <w:right w:w="100" w:type="dxa"/>
-        </w:tblCellMar>
-      </w:tblPr>
-      <w:tblGrid>
-        <w:gridCol w:w="2500"/>
-        <w:gridCol w:w="5238"/>
-        <w:gridCol w:w="1900"/>
-      </w:tblGrid>
-      <w:tr>
-        <w:tc>
-          <w:tcPr>
-            <w:tcW w:w="2500" w:type="dxa"/>
-            <w:shd w:val="clear" w:color="auto" w:fill="003764"/>
-            <w:vAlign w:val="center"/>
-          </w:tcPr>
-          <w:p>
-            <w:pPr>
-              <w:spacing w:before="0" w:after="20" w:line="264" w:lineRule="auto"/>
-            </w:pPr>
-            <w:r>
-              <w:rPr>
-                <w:rFonts w:ascii="Calibri" w:hAnsi="Calibri" w:cs="Calibri"/>
-                <w:b/>
-                <w:sz w:val="20"/>
-                <w:szCs w:val="20"/>
-                <w:color w:val="FFFFFF"/>
-              </w:rPr>
-              <w:t xml:space="preserve">Formule</w:t>
-            </w:r>
-          </w:p>
-        </w:tc>
-        <w:tc>
-          <w:tcPr>
-            <w:tcW w:w="5238" w:type="dxa"/>
-            <w:shd w:val="clear" w:color="auto" w:fill="003764"/>
-            <w:vAlign w:val="center"/>
-          </w:tcPr>
-          <w:p>
-            <w:pPr>
-              <w:spacing w:before="0" w:after="20" w:line="264" w:lineRule="auto"/>
-            </w:pPr>
-            <w:r>
-              <w:rPr>
-                <w:rFonts w:ascii="Calibri" w:hAnsi="Calibri" w:cs="Calibri"/>
-                <w:b/>
-                <w:sz w:val="20"/>
-                <w:szCs w:val="20"/>
-                <w:color w:val="FFFFFF"/>
-              </w:rPr>
-              <w:t xml:space="preserve">Chaque mois</w:t>
-            </w:r>
-          </w:p>
-        </w:tc>
-        <w:tc>
-          <w:tcPr>
-            <w:tcW w:w="1900" w:type="dxa"/>
-            <w:shd w:val="clear" w:color="auto" w:fill="003764"/>
-            <w:vAlign w:val="center"/>
-          </w:tcPr>
-          <w:p>
-            <w:pPr>
-              <w:spacing w:before="0" w:after="20" w:line="264" w:lineRule="auto"/>
-              <w:jc w:val="right"/>
-            </w:pPr>
-            <w:r>
-              <w:rPr>
-                <w:rFonts w:ascii="Calibri" w:hAnsi="Calibri" w:cs="Calibri"/>
-                <w:b/>
-                <w:sz w:val="20"/>
-                <w:szCs w:val="20"/>
-                <w:color w:val="FFFFFF"/>
-              </w:rPr>
-              <w:t xml:space="preserve">Tarif HT</w:t>
-            </w:r>
-          </w:p>
-        </w:tc>
-      </w:tr>
-      <w:tr>
-        <w:tc>
-          <w:tcPr>
-            <w:tcW w:w="2500" w:type="dxa"/>
-            <w:vAlign w:val="center"/>
-          </w:tcPr>
-          <w:p>
-            <w:pPr>
-              <w:spacing w:before="0" w:after="20" w:line="264" w:lineRule="auto"/>
-            </w:pPr>
-            <w:r>
-              <w:rPr>
-                <w:rFonts w:ascii="Calibri" w:hAnsi="Calibri" w:cs="Calibri"/>
-                <w:b/>
-                <w:sz w:val="20"/>
-                <w:szCs w:val="20"/>
-              </w:rPr>
-              <w:t xml:space="preserve">Suivi</w:t>
-            </w:r>
-          </w:p>
-        </w:tc>
-        <w:tc>
-          <w:tcPr>
-            <w:tcW w:w="5238" w:type="dxa"/>
-            <w:vAlign w:val="center"/>
-          </w:tcPr>
-          <w:p>
-            <w:pPr>
-              <w:spacing w:before="0" w:after="20" w:line="264" w:lineRule="auto"/>
-            </w:pPr>
-            <w:r>
-              <w:rPr>
-                <w:rFonts w:ascii="Calibri" w:hAnsi="Calibri" w:cs="Calibri"/>
-                <w:sz w:val="19"/>
-                <w:szCs w:val="19"/>
-              </w:rPr>
-              <w:t xml:space="preserve">Les vingt mêmes questions reposées sur quatre moteurs, trois passages chacun ; tableau de bord en français (citations, concurrents cités, sources) ; 30 minutes d’échange en visio.</w:t>
-            </w:r>
-          </w:p>
-        </w:tc>
-        <w:tc>
-          <w:tcPr>
-            <w:tcW w:w="1900" w:type="dxa"/>
-            <w:shd w:val="clear" w:color="auto" w:fill="F2F2F2"/>
-            <w:vAlign w:val="center"/>
-          </w:tcPr>
-          <w:p>
-            <w:pPr>
-              <w:spacing w:before="0" w:after="20" w:line="264" w:lineRule="auto"/>
-              <w:jc w:val="right"/>
-            </w:pPr>
-            <w:r>
-              <w:rPr>
-                <w:rFonts w:ascii="Calibri" w:hAnsi="Calibri" w:cs="Calibri"/>
-                <w:b/>
-                <w:sz w:val="20"/>
-                <w:szCs w:val="20"/>
-                <w:color w:val="003764"/>
-              </w:rPr>
-              <w:t xml:space="preserve">290 €/mois</w:t>
-            </w:r>
-          </w:p>
-        </w:tc>
-      </w:tr>
-      <w:tr>
-        <w:tc>
-          <w:tcPr>
-            <w:tcW w:w="2500" w:type="dxa"/>
-            <w:vAlign w:val="center"/>
-          </w:tcPr>
-          <w:p>
-            <w:pPr>
-              <w:spacing w:before="0" w:after="20" w:line="264" w:lineRule="auto"/>
-            </w:pPr>
-            <w:r>
-              <w:rPr>
-                <w:rFonts w:ascii="Calibri" w:hAnsi="Calibri" w:cs="Calibri"/>
-                <w:b/>
-                <w:sz w:val="20"/>
-                <w:szCs w:val="20"/>
-              </w:rPr>
-              <w:t xml:space="preserve">Accompagnement</w:t>
-            </w:r>
-          </w:p>
-        </w:tc>
-        <w:tc>
-          <w:tcPr>
-            <w:tcW w:w="5238" w:type="dxa"/>
-            <w:vAlign w:val="center"/>
-          </w:tcPr>
-          <w:p>
-            <w:pPr>
-              <w:spacing w:before="0" w:after="20" w:line="264" w:lineRule="auto"/>
-            </w:pPr>
-            <w:r>
-              <w:rPr>
-                <w:rFonts w:ascii="Calibri" w:hAnsi="Calibri" w:cs="Calibri"/>
-                <w:sz w:val="19"/>
-                <w:szCs w:val="19"/>
-              </w:rPr>
-              <w:t xml:space="preserve">Le suivi, plus une page réponse ou un contenu citable (chiffres sourcés), les corrections techniques qui en découlent, une action sur les sites tiers que les IA lisent, le SEO de base compris.</w:t>
-            </w:r>
-          </w:p>
-        </w:tc>
-        <w:tc>
-          <w:tcPr>
-            <w:tcW w:w="1900" w:type="dxa"/>
-            <w:shd w:val="clear" w:color="auto" w:fill="F2F2F2"/>
-            <w:vAlign w:val="center"/>
-          </w:tcPr>
-          <w:p>
-            <w:pPr>
-              <w:spacing w:before="0" w:after="20" w:line="264" w:lineRule="auto"/>
-              <w:jc w:val="right"/>
-            </w:pPr>
-            <w:r>
-              <w:rPr>
-                <w:rFonts w:ascii="Calibri" w:hAnsi="Calibri" w:cs="Calibri"/>
-                <w:b/>
-                <w:sz w:val="20"/>
-                <w:szCs w:val="20"/>
-                <w:color w:val="003764"/>
-              </w:rPr>
-              <w:t xml:space="preserve">790 €/mois</w:t>
+              <w:t xml:space="preserve">890 €/mois</w:t>
             </w:r>
           </w:p>
         </w:tc>
@@ -2808,7 +2664,7 @@
           <w:szCs w:val="18"/>
           <w:color w:val="595959"/>
         </w:rPr>
-        <w:t xml:space="preserve">Sans engagement de durée, préavis de 30 jours. L’audit est déduit de votre première facture si un accompagnement démarre dans les 30 jours. Aucune garantie d’être cité : les moteurs changent de réponse d’un appel à l’autre, et personne ne contrôle leurs choix. Ce qui est garanti, c’est une mesure honnête, refaite à l’identique chaque mois.</w:t>
+        <w:t xml:space="preserve">Sans engagement de durée, préavis de 30 jours. Le Suivi convient à une entreprise qui a déjà son équipe ou son prestataire et veut une mesure indépendante. Sur Google, comptez 6 mois pour des résultats solides : nous le disons avant de facturer, pas après. Côté IA, aucune garantie d’être cité : les moteurs changent de réponse d’un appel à l’autre, et personne ne contrôle leurs choix. Ce qui est garanti, c’est une mesure honnête, refaite à l’identique chaque mois.</w:t>
       </w:r>
     </w:p>
     <w:p>
@@ -2887,7 +2743,7 @@
                 <w:sz w:val="21"/>
                 <w:szCs w:val="21"/>
               </w:rPr>
-              <w:t xml:space="preserve">1 690 € HT</w:t>
+              <w:t xml:space="preserve">1 690 € HT</w:t>
             </w:r>
             <w:r>
               <w:rPr>
@@ -2895,7 +2751,7 @@
                 <w:sz w:val="21"/>
                 <w:szCs w:val="21"/>
               </w:rPr>
-              <w:t xml:space="preserve"> au lieu de 1 880 €. Le socle technique IA est déjà inclus dans le site. C’est l’équipement complet d’un artisan ou d’un commerce qui démarre sa visibilité.</w:t>
+              <w:t xml:space="preserve"> au lieu de 1 880 €. Le socle technique IA est déjà inclus dans le site. C’est l’équipement complet d’un artisan ou d’un commerce qui démarre sa visibilité.</w:t>
             </w:r>
           </w:p>
         </w:tc>
@@ -2914,7 +2770,7 @@
           <w:szCs w:val="30"/>
           <w:color w:val="003764"/>
         </w:rPr>
-        <w:t xml:space="preserve">4. Où se situent ces prix sur le marché ?</w:t>
+        <w:t xml:space="preserve">5. Où se situent ces prix sur le marché ?</w:t>
       </w:r>
     </w:p>
     <w:p>
@@ -3059,7 +2915,7 @@
                 <w:sz w:val="19"/>
                 <w:szCs w:val="19"/>
               </w:rPr>
-              <w:t xml:space="preserve">900 à 5 000 € (grille France Num / Afnic, juin 2025) ; 3 000 à 8 000 € en agence (relevés 2026).</w:t>
+              <w:t xml:space="preserve">900 à 5 000 € (grille France Num / Afnic, juin 2025) ; 3 000 à 8 000 € en agence (relevés 2026).</w:t>
             </w:r>
           </w:p>
         </w:tc>
@@ -3082,7 +2938,7 @@
                 <w:szCs w:val="20"/>
                 <w:color w:val="003764"/>
               </w:rPr>
-              <w:t xml:space="preserve">1 490 €</w:t>
+              <w:t xml:space="preserve">1 490 €</w:t>
             </w:r>
           </w:p>
         </w:tc>
@@ -3123,7 +2979,7 @@
                 <w:sz w:val="19"/>
                 <w:szCs w:val="19"/>
               </w:rPr>
-              <w:t xml:space="preserve">3 000 à 10 000 € (France Num / Afnic) ; budget conseillé 4 000 à 6 000 € pour un WooCommerce bien configuré (relevés 2026).</w:t>
+              <w:t xml:space="preserve">3 000 à 10 000 € (France Num / Afnic) ; budget conseillé 4 000 à 6 000 € pour un WooCommerce bien configuré (relevés 2026).</w:t>
             </w:r>
           </w:p>
         </w:tc>
@@ -3146,7 +3002,7 @@
                 <w:szCs w:val="20"/>
                 <w:color w:val="003764"/>
               </w:rPr>
-              <w:t xml:space="preserve">dès 2 990 €</w:t>
+              <w:t xml:space="preserve">dès 2 990 €</w:t>
             </w:r>
           </w:p>
         </w:tc>
@@ -3187,7 +3043,7 @@
                 <w:sz w:val="19"/>
                 <w:szCs w:val="19"/>
               </w:rPr>
-              <w:t xml:space="preserve">500 à 3 000 €, le plus souvent 800 à 1 200 € pour un site vitrine (relevés 2026).</w:t>
+              <w:t xml:space="preserve">500 à 3 000 €, le plus souvent 800 à 1 200 € pour un site vitrine (relevés 2026).</w:t>
             </w:r>
           </w:p>
         </w:tc>
@@ -3232,7 +3088,7 @@
                 <w:sz w:val="20"/>
                 <w:szCs w:val="20"/>
               </w:rPr>
-              <w:t xml:space="preserve">SEO mensuel</w:t>
+              <w:t xml:space="preserve">SEO local</w:t>
             </w:r>
           </w:p>
         </w:tc>
@@ -3251,7 +3107,7 @@
                 <w:sz w:val="19"/>
                 <w:szCs w:val="19"/>
               </w:rPr>
-              <w:t xml:space="preserve">500 à 2 500 €/mois (seo.fr, juin 2026) ; jusqu’à 5 000 €/mois en agence (relevés 2026).</w:t>
+              <w:t xml:space="preserve">100 à 500 €/mois pour la seule gestion de la fiche Google (relevés 2026).</w:t>
             </w:r>
           </w:p>
         </w:tc>
@@ -3274,7 +3130,7 @@
                 <w:szCs w:val="20"/>
                 <w:color w:val="003764"/>
               </w:rPr>
-              <w:t xml:space="preserve">390 à 690 €/mois</w:t>
+              <w:t xml:space="preserve">390 € + option 99 €/mois</w:t>
             </w:r>
           </w:p>
         </w:tc>
@@ -3296,7 +3152,7 @@
                 <w:sz w:val="20"/>
                 <w:szCs w:val="20"/>
               </w:rPr>
-              <w:t xml:space="preserve">SEO local</w:t>
+              <w:t xml:space="preserve">Audit référencement IA</w:t>
             </w:r>
           </w:p>
         </w:tc>
@@ -3315,7 +3171,7 @@
                 <w:sz w:val="19"/>
                 <w:szCs w:val="19"/>
               </w:rPr>
-              <w:t xml:space="preserve">100 à 500 €/mois pour la seule gestion de la fiche Google (relevés 2026).</w:t>
+              <w:t xml:space="preserve">1 200 € chez un consultant indépendant (relevé de septembre 2026) ; 1 500 à 3 000 € chez les agences GEO (relevés 2026, marché jeune et peu standardisé).</w:t>
             </w:r>
           </w:p>
         </w:tc>
@@ -3338,7 +3194,7 @@
                 <w:szCs w:val="20"/>
                 <w:color w:val="003764"/>
               </w:rPr>
-              <w:t xml:space="preserve">390 € + option 99 €/mois</w:t>
+              <w:t xml:space="preserve">790 €</w:t>
             </w:r>
           </w:p>
         </w:tc>
@@ -3360,7 +3216,7 @@
                 <w:sz w:val="20"/>
                 <w:szCs w:val="20"/>
               </w:rPr>
-              <w:t xml:space="preserve">Audit référencement IA</w:t>
+              <w:t xml:space="preserve">Accompagnement mensuel SEO + IA</w:t>
             </w:r>
           </w:p>
         </w:tc>
@@ -3379,7 +3235,7 @@
                 <w:sz w:val="19"/>
                 <w:szCs w:val="19"/>
               </w:rPr>
-              <w:t xml:space="preserve">1 200 € chez un consultant indépendant (relevé de septembre 2026) ; 1 500 à 3 000 € chez les agences GEO (relevés 2026, marché jeune et peu standardisé).</w:t>
+              <w:t xml:space="preserve">SEO : 500 à 2 500 €/mois (seo.fr, juin 2026), jusqu’à 5 000 €/mois en agence (relevés 2026). Référencement IA : 800 à 2 000 €/mois chez un consultant indépendant, 800 à 3 000 €/mois en agence (relevés de septembre 2026).</w:t>
             </w:r>
           </w:p>
         </w:tc>
@@ -3402,71 +3258,7 @@
                 <w:szCs w:val="20"/>
                 <w:color w:val="003764"/>
               </w:rPr>
-              <w:t xml:space="preserve">790 €</w:t>
-            </w:r>
-          </w:p>
-        </w:tc>
-      </w:tr>
-      <w:tr>
-        <w:tc>
-          <w:tcPr>
-            <w:tcW w:w="2300" w:type="dxa"/>
-            <w:vAlign w:val="center"/>
-          </w:tcPr>
-          <w:p>
-            <w:pPr>
-              <w:spacing w:before="0" w:after="20" w:line="264" w:lineRule="auto"/>
-            </w:pPr>
-            <w:r>
-              <w:rPr>
-                <w:rFonts w:ascii="Calibri" w:hAnsi="Calibri" w:cs="Calibri"/>
-                <w:b/>
-                <w:sz w:val="20"/>
-                <w:szCs w:val="20"/>
-              </w:rPr>
-              <w:t xml:space="preserve">Référencement IA mensuel</w:t>
-            </w:r>
-          </w:p>
-        </w:tc>
-        <w:tc>
-          <w:tcPr>
-            <w:tcW w:w="5138" w:type="dxa"/>
-            <w:vAlign w:val="center"/>
-          </w:tcPr>
-          <w:p>
-            <w:pPr>
-              <w:spacing w:before="0" w:after="20" w:line="264" w:lineRule="auto"/>
-            </w:pPr>
-            <w:r>
-              <w:rPr>
-                <w:rFonts w:ascii="Calibri" w:hAnsi="Calibri" w:cs="Calibri"/>
-                <w:sz w:val="19"/>
-                <w:szCs w:val="19"/>
-              </w:rPr>
-              <w:t xml:space="preserve">800 à 2 000 €/mois chez un consultant indépendant, 800 à 3 000 €/mois en agence (relevés de septembre 2026).</w:t>
-            </w:r>
-          </w:p>
-        </w:tc>
-        <w:tc>
-          <w:tcPr>
-            <w:tcW w:w="2200" w:type="dxa"/>
-            <w:shd w:val="clear" w:color="auto" w:fill="F2F2F2"/>
-            <w:vAlign w:val="center"/>
-          </w:tcPr>
-          <w:p>
-            <w:pPr>
-              <w:spacing w:before="0" w:after="20" w:line="264" w:lineRule="auto"/>
-              <w:jc w:val="right"/>
-            </w:pPr>
-            <w:r>
-              <w:rPr>
-                <w:rFonts w:ascii="Calibri" w:hAnsi="Calibri" w:cs="Calibri"/>
-                <w:b/>
-                <w:sz w:val="20"/>
-                <w:szCs w:val="20"/>
-                <w:color w:val="003764"/>
-              </w:rPr>
-              <w:t xml:space="preserve">290 à 790 €/mois</w:t>
+              <w:t xml:space="preserve">290 à 890 €/mois, les deux compris</w:t>
             </w:r>
           </w:p>
         </w:tc>
@@ -3678,7 +3470,7 @@
         <w:szCs w:val="15"/>
         <w:color w:val="595959"/>
       </w:rPr>
-      <w:t xml:space="preserve">MKZ · SAS à associé unique · SIRET 983 662 784 00013 · RCS Meaux · 1 rue Françoise Sagan, 77230 Dammartin-en-Goële · contact@mkz-consulting.fr · 07 69 09 39 09</w:t>
+      <w:t xml:space="preserve">MKZ · SAS à associé unique · SIRET 983 662 784 00013 · RCS Meaux · 1 rue Françoise Sagan, 77230 Dammartin-en-Goële · contact@mkz-consulting.fr · 07 69 09 39 09</w:t>
     </w:r>
   </w:p>
   <w:p>

</xml_diff>